<commit_message>
fix(auditoria): adotar competitive (weakly inhibitory) na Prop 7A e desacoplamento com a distincao P versus NP no Firewall sem afirmar P!=NP
</commit_message>
<xml_diff>
--- a/Publicacoes/RespostaAoProfessor_Analise19.docx
+++ b/Publicacoes/RespostaAoProfessor_Analise19.docx
@@ -468,7 +468,7 @@
           <w:color w:val="222222"/>
           <w:sz w:val="21"/>
         </w:rPr>
-        <w:t>* A conclusão de que o sistema é competitivo/inibitório e viola a condição de Kamke-Müller ($J_{ij} \ge 0$), impedindo a invocação direta da teoria monótona/cooperativa de Hirsch;</w:t>
+        <w:t>* A conclusão de que o sistema é competitivo (fracamente inibitório), com entradas não-positivas fora da diagonal ($J_{ij} \le 0$), violando a condição de Kamke-Müller ($J_{ij} \ge 0$) e impedindo a invocação direta da teoria monótona/cooperativa de Hirsch;</w:t>
       </w:r>
     </w:p>
     <w:p>
@@ -1670,7 +1670,7 @@
                 <w:rFonts w:ascii="Calibri" w:hAnsi="Calibri"/>
                 <w:sz w:val="19"/>
               </w:rPr>
-              <w:t>Derivada cruzada $\ge 0 \implies J_{ij} \le 0$ (Hirsch suspenso; Item 2 de $A_N$ expurgado).</w:t>
+              <w:t>Derivada cruzada $\ge 0 \implies J_{ij} \le 0$ (competitivo/fracamente inibitório; Hirsch suspenso; Item 2 de $A_N$ expurgado).</w:t>
             </w:r>
           </w:p>
         </w:tc>
@@ -2041,7 +2041,7 @@
                 <w:rFonts w:ascii="Calibri" w:hAnsi="Calibri"/>
                 <w:sz w:val="19"/>
               </w:rPr>
-              <w:t>Desacoplamento categórico entre colapso contínuo e complexidade de Turing ($P \ne NP$).</w:t>
+              <w:t>Desacoplamento entre a dificuldade dinâmica contínua e a distinção P versus NP.</w:t>
             </w:r>
           </w:p>
         </w:tc>

</xml_diff>